<commit_message>
Docs: the fleet is the only way to start and cut over tasks
One DMS task is a one-row fleet_tasks.csv. Setup always deploys the fleet (preflight Lambda, fleet-startup / fleet-cutover); the per-task startup and cutover workflows are what the fleet runs and are no longer started directly. RUNBOOK, README, USAGE_GUIDE (md + docx) and FLEET_LAUNCHER updated to match; diagram label no longer calls the fleet optional. Docs only.
</commit_message>
<xml_diff>
--- a/docs/USAGE_GUIDE.docx
+++ b/docs/USAGE_GUIDE.docx
@@ -1204,7 +1204,7 @@
           <w:b w:val="0"/>
           <w:i w:val="0"/>
         </w:rPr>
-        <w:t>Create one startup and one cutover state machine, shared by every AWS DMS task, filling in the bucket and the function ARNs. Each run is started with one task's ARN and works in that task's own folder and AWS Glue jobs, so tasks run, fail, resume, and cut over independently. Optional fleet state machines start or cut over many tasks from one list (see docs/FLEET_LAUNCHER.md).</w:t>
+        <w:t>Create the shared startup and cutover state machines (one of each, used by every AWS DMS task) and the two fleet state machines (fleet-startup and fleet-cutover), filling in the bucket and the function ARNs. You launch a fleet to start or cut over tasks; it reads a list of tasks (fleet_tasks.csv) and runs the shared startup (or cutover) once per task, each in that task's own folder and AWS Glue jobs, so tasks run, fail, resume, and cut over independently (see docs/FLEET_LAUNCHER.md).</w:t>
       </w:r>
     </w:p>
     <w:p>
@@ -1221,7 +1221,7 @@
           <w:b w:val="0"/>
           <w:i w:val="0"/>
         </w:rPr>
-        <w:t>Start the startup state machine with the task's ARN:</w:t>
+        <w:t>Start every migration — one task or many — through the fleet-startup state machine. Put one row per DMS task in fleet_tasks.csv (task_arn, optional task_suffix, optional adopt_existing_folder), upload it to the bucket, and launch the fleet once with the bucket and the folder that holds the list: {"bucket": "&lt;pipeline bucket&gt;", "inputPrefix": "&lt;folder of fleet_tasks.csv&gt;"}. Preflight checks every task first and starts nothing if any row fails; otherwise it starts one startup execution per task (five at a time) with that task's ARN.</w:t>
       </w:r>
     </w:p>
     <w:tbl>
@@ -1312,7 +1312,7 @@
           <w:b w:val="0"/>
           <w:i w:val="0"/>
         </w:rPr>
-        <w:t>The state machine performs the following steps:</w:t>
+        <w:t>Each per-task startup the fleet starts performs the following steps:</w:t>
       </w:r>
     </w:p>
     <w:p>
@@ -2619,13 +2619,13 @@
           <w:b w:val="0"/>
           <w:i w:val="0"/>
         </w:rPr>
-        <w:t>When CDC has caught up, with all tables idle and source and target row counts in agreement, stop writes to the source for this task's tables (for example, put the application in maintenance mode) and let AWS DMS deliver the last changes before you cut over: cutover stops AWS DMS first, so any source change made after that is not migrated. Then start the cutover state machine with the task's ARN. It stops the AWS DMS task, confirms that the latest CDC output has been applied, stops the CDC job, removes the CDC tracking column, and deletes the task's five AWS Glue jobs (discovery, load, load-big, validate, and CDC). Then repoint the application to Aurora DSQL. Other tasks are unaffected.</w:t>
+        <w:t>Cut over through the fleet-cutover state machine, the same way as startup: one launch reads fleet_tasks.csv and runs the shared cutover once per task (a single task is a one-row list). Before you launch it, for every table of every task in the list: when CDC has caught up, with all tables idle and source and target row counts in agreement, stop writes to the source for that task's tables (for example, put the application in maintenance mode) and let AWS DMS deliver the last changes — each task's cutover stops AWS DMS first, so any source change made after that is not migrated. The fleet checks inputs, not readiness, and cutover is irreversible per task, so only list tasks whose CDC has caught up. Each per-task cutover stops the AWS DMS task, confirms that the latest CDC output has been applied, stops the CDC job, removes the CDC tracking column, and deletes the task's five AWS Glue jobs (discovery, load, load-big, validate, and CDC). Then repoint the application to Aurora DSQL. Other tasks are unaffected.</w:t>
       </w:r>
     </w:p>
     <w:p>
       <w:pPr/>
       <w:r>
-        <w:t>Once the AWS DMS task is stopped, do not start the cutover again: its first step stops the AWS DMS task, which the AWS DMS API rejects for a task that is already stopped, so a re-run ends in a cutover failure within a couple of minutes without finishing. If a cutover fails after AWS DMS was stopped, finish the remaining steps by hand (stop the CDC run, drop the _cdc_file column on each table, delete the task's five AWS Glue jobs). If every step succeeds except deleting an AWS Glue job, the run ends at GlueJobsNotDeleted and names the job: the data is already cut over, so delete that job by hand (aws glue delete-job) rather than re-running the cutover.</w:t>
+        <w:t>Once a task's AWS DMS task is stopped, do not cut that task over again: the first step stops the AWS DMS task, which the AWS DMS API rejects for a task that is already stopped, so a re-run ends in a cutover failure within a couple of minutes without finishing. Re-launching the fleet is safe — a task whose cutover is already running is skipped (already_running) — but a task that failed after AWS DMS was stopped must have its remaining steps finished by hand (stop the CDC run, drop the _cdc_file column on each table, delete the task's five AWS Glue jobs). If every step succeeds except deleting an AWS Glue job, the run ends at GlueJobsNotDeleted and names the job: the data is already cut over, so delete that job by hand (aws glue delete-job) rather than re-running that task's cutover.</w:t>
       </w:r>
     </w:p>
     <w:p>

</xml_diff>

<commit_message>
Add params.csv settings file + tools/setup.sh one-command setup; fleet safe-publish of pipeline.json; docs updated (offline-tested, real-AWS test pending)
</commit_message>
<xml_diff>
--- a/docs/USAGE_GUIDE.docx
+++ b/docs/USAGE_GUIDE.docx
@@ -456,6 +456,20 @@
           <w:i w:val="0"/>
         </w:rPr>
         <w:t>The pipeline uses a single S3 bucket with a fixed folder layout. You choose the bucket name; each task's folder and AWS Glue job names come from its AWS DMS task name. The folder names are referenced by the templates and do not change.</w:t>
+      </w:r>
+    </w:p>
+    <w:p>
+      <w:pPr>
+        <w:pStyle w:val="Heading2"/>
+      </w:pPr>
+      <w:r>
+        <w:t>Configure settings with params.csv (recommended)</w:t>
+      </w:r>
+    </w:p>
+    <w:p>
+      <w:pPr/>
+      <w:r>
+        <w:t>Put every setup value in one params.csv file and let the pipeline build the shared settings from it, so nobody retypes an export block. Copy config/params.example.csv, set account_id, Region, project, and dsql_endpoint (plus any optional keys), and upload it to s3://&lt;bucket&gt;/config/params.csv next to fleet_tasks.csv. Then run tools/setup.sh s3://&lt;bucket&gt;/config/params.csv to create or update all six IAM roles, eight Lambda functions, four state machines, and config/pipeline.json in one idempotent pass (add --dry-run to preview the commands, or --with-drivers to stage the Glue driver packages). The fleet reads the same params.csv at startup and safely republishes config/pipeline.json from it only when no startup, cutover, or fleet run is in progress, backing up the previous settings first. The account_id, subnet_id, and security_group_id values are used only by setup and are never written into config/pipeline.json. The hand-edited setup steps below still work if you prefer them. Note: params.csv is offline-tested; the real-AWS test is pending, so run one small live fleet first.</w:t>
       </w:r>
     </w:p>
     <w:tbl>

</xml_diff>

<commit_message>
Build table list automatically from the DMS task (no table_manifest upload); combine IAM into one role per service (glue/lambda/stepfunctions); DSQL VPC endpoint note; refreshed architecture diagram (offline-tested, real-AWS test pending)
</commit_message>
<xml_diff>
--- a/docs/USAGE_GUIDE.docx
+++ b/docs/USAGE_GUIDE.docx
@@ -358,7 +358,7 @@
         <w:pStyle w:val="ListBullet"/>
       </w:pPr>
       <w:r>
-        <w:t>A table mapping that lowercases column names. Schema and table names can stay in any case: list each table in the task's table manifest as AWS DMS writes it (after any schema rename), and the pipeline finds its folder.</w:t>
+        <w:t>A table mapping that lowercases column names. Schema and table names can stay in any case; the pipeline reads the names AWS DMS writes (after any schema rename) and finds each table's folder.</w:t>
       </w:r>
     </w:p>
     <w:p>
@@ -374,7 +374,7 @@
         <w:pStyle w:val="ListBullet"/>
       </w:pPr>
       <w:r>
-        <w:t>One S3 bucket that holds the Glue scripts, job templates, driver packages, and each task's table manifest, and receives the AWS DMS output.</w:t>
+        <w:t>One S3 bucket that holds the Glue scripts, job templates, and driver packages, and receives the AWS DMS output.</w:t>
       </w:r>
     </w:p>
     <w:p>
@@ -689,7 +689,7 @@
           <w:b w:val="0"/>
           <w:i w:val="0"/>
         </w:rPr>
-        <w:t>Copy the Glue scripts, job templates, and driver packages into the bucket, and stage the per-task table manifest. The pipeline retrieves all runtime dependencies from Amazon S3 and does not download packages at run time.</w:t>
+        <w:t>Copy the Glue scripts, job templates, and driver packages into the bucket. The pipeline retrieves all runtime dependencies from Amazon S3 and does not download packages at run time. Each task's table list is built automatically from the AWS DMS task after its full load, so there is nothing else to stage.</w:t>
       </w:r>
     </w:p>
     <w:tbl>
@@ -1351,6 +1351,14 @@
       </w:pPr>
       <w:r>
         <w:t>Starts the AWS DMS task and waits for the full load and cached changes to complete.</w:t>
+      </w:r>
+    </w:p>
+    <w:p>
+      <w:pPr>
+        <w:pStyle w:val="ListNumber"/>
+      </w:pPr>
+      <w:r>
+        <w:t>Builds the task's table list from the AWS DMS task (table statistics plus the task's table-mapping transformations) and writes it to the task's folder. This runs after the full load and before any AWS Glue job; it stops the run if a table did not load, a mapping transformation cannot be reproduced, or more than nine target schemas result.</w:t>
       </w:r>
     </w:p>
     <w:p>

</xml_diff>

<commit_message>
Docs: remove the offline-tested / real-AWS-pending notes
</commit_message>
<xml_diff>
--- a/docs/USAGE_GUIDE.docx
+++ b/docs/USAGE_GUIDE.docx
@@ -469,7 +469,7 @@
     <w:p>
       <w:pPr/>
       <w:r>
-        <w:t>Put every setup value in one params.csv file and let the pipeline build the shared settings from it, so nobody retypes an export block. Copy config/params.example.csv, set account_id, Region, project, and dsql_endpoint (plus any optional keys), and upload it to s3://&lt;bucket&gt;/config/params.csv next to fleet_tasks.csv. Then run tools/setup.sh s3://&lt;bucket&gt;/config/params.csv to create or update all six IAM roles, eight Lambda functions, four state machines, and config/pipeline.json in one idempotent pass (add --dry-run to preview the commands, or --with-drivers to stage the Glue driver packages). The fleet reads the same params.csv at startup and safely republishes config/pipeline.json from it only when no startup, cutover, or fleet run is in progress, backing up the previous settings first. The account_id, subnet_id, and security_group_id values are used only by setup and are never written into config/pipeline.json. The hand-edited setup steps below still work if you prefer them. Note: params.csv is offline-tested; the real-AWS test is pending, so run one small live fleet first.</w:t>
+        <w:t>Put every setup value in one params.csv file and let the pipeline build the shared settings from it, so nobody retypes an export block. Copy config/params.example.csv, set account_id, Region, project, and dsql_endpoint (plus any optional keys), and upload it to s3://&lt;bucket&gt;/config/params.csv next to fleet_tasks.csv. Then run tools/setup.sh s3://&lt;bucket&gt;/config/params.csv to create or update all six IAM roles, eight Lambda functions, four state machines, and config/pipeline.json in one idempotent pass (add --dry-run to preview the commands, or --with-drivers to stage the Glue driver packages). The fleet reads the same params.csv at startup and safely republishes config/pipeline.json from it only when no startup, cutover, or fleet run is in progress, backing up the previous settings first. The account_id, subnet_id, and security_group_id values are used only by setup and are never written into config/pipeline.json. The hand-edited setup steps below still work if you prefer them.</w:t>
       </w:r>
     </w:p>
     <w:tbl>
@@ -3105,6 +3105,11 @@
     </w:p>
     <w:sectPr>
       <w:footerReference w:type="default" r:id="rId9"/>
+      <w:headerReference w:type="default" r:id="rId10"/>
+      <w:headerReference w:type="first" r:id="rId11"/>
+      <w:footerReference w:type="first" r:id="rId12"/>
+      <w:headerReference w:type="even" r:id="rId13"/>
+      <w:footerReference w:type="even" r:id="rId14"/>
       <w:pgSz w:w="12240" w:h="15840"/>
       <w:pgMar w:top="1440" w:right="1800" w:bottom="1440" w:left="1800" w:header="720" w:footer="720" w:gutter="0"/>
       <w:cols w:space="720"/>
@@ -3130,6 +3135,56 @@
     </w:r>
   </w:p>
 </w:ftr>
+</file>
+
+<file path=word/footer2.xml><?xml version="1.0" encoding="utf-8"?>
+<w:ftr xmlns:m="http://schemas.openxmlformats.org/officeDocument/2006/math" xmlns:mc="http://schemas.openxmlformats.org/markup-compatibility/2006" xmlns:mo="http://schemas.microsoft.com/office/mac/office/2008/main" xmlns:mv="urn:schemas-microsoft-com:mac:vml" xmlns:o="urn:schemas-microsoft-com:office:office" xmlns:r="http://schemas.openxmlformats.org/officeDocument/2006/relationships" xmlns:v="urn:schemas-microsoft-com:vml" xmlns:w10="urn:schemas-microsoft-com:office:word" xmlns:w14="http://schemas.microsoft.com/office/word/2010/wordml" xmlns:w="http://schemas.openxmlformats.org/wordprocessingml/2006/main" xmlns:wne="http://schemas.microsoft.com/office/word/2006/wordml" xmlns:wp14="http://schemas.microsoft.com/office/word/2010/wordprocessingDrawing" xmlns:wp="http://schemas.openxmlformats.org/drawingml/2006/wordprocessingDrawing" xmlns:wpc="http://schemas.microsoft.com/office/word/2010/wordprocessingCanvas" xmlns:wpg="http://schemas.microsoft.com/office/word/2010/wordprocessingGroup" xmlns:wpi="http://schemas.microsoft.com/office/word/2010/wordprocessingInk" xmlns:wps="http://schemas.microsoft.com/office/word/2010/wordprocessingShape" mc:Ignorable="w14 wp14">
+  <w:p>
+    <w:pPr>
+      <w:pStyle w:val="Footer"/>
+    </w:pPr>
+  </w:p>
+</w:ftr>
+</file>
+
+<file path=word/footer3.xml><?xml version="1.0" encoding="utf-8"?>
+<w:ftr xmlns:m="http://schemas.openxmlformats.org/officeDocument/2006/math" xmlns:mc="http://schemas.openxmlformats.org/markup-compatibility/2006" xmlns:mo="http://schemas.microsoft.com/office/mac/office/2008/main" xmlns:mv="urn:schemas-microsoft-com:mac:vml" xmlns:o="urn:schemas-microsoft-com:office:office" xmlns:r="http://schemas.openxmlformats.org/officeDocument/2006/relationships" xmlns:v="urn:schemas-microsoft-com:vml" xmlns:w10="urn:schemas-microsoft-com:office:word" xmlns:w14="http://schemas.microsoft.com/office/word/2010/wordml" xmlns:w="http://schemas.openxmlformats.org/wordprocessingml/2006/main" xmlns:wne="http://schemas.microsoft.com/office/word/2006/wordml" xmlns:wp14="http://schemas.microsoft.com/office/word/2010/wordprocessingDrawing" xmlns:wp="http://schemas.openxmlformats.org/drawingml/2006/wordprocessingDrawing" xmlns:wpc="http://schemas.microsoft.com/office/word/2010/wordprocessingCanvas" xmlns:wpg="http://schemas.microsoft.com/office/word/2010/wordprocessingGroup" xmlns:wpi="http://schemas.microsoft.com/office/word/2010/wordprocessingInk" xmlns:wps="http://schemas.microsoft.com/office/word/2010/wordprocessingShape" mc:Ignorable="w14 wp14">
+  <w:p>
+    <w:pPr>
+      <w:pStyle w:val="Footer"/>
+    </w:pPr>
+  </w:p>
+</w:ftr>
+</file>
+
+<file path=word/header1.xml><?xml version="1.0" encoding="utf-8"?>
+<w:hdr xmlns:m="http://schemas.openxmlformats.org/officeDocument/2006/math" xmlns:mc="http://schemas.openxmlformats.org/markup-compatibility/2006" xmlns:mo="http://schemas.microsoft.com/office/mac/office/2008/main" xmlns:mv="urn:schemas-microsoft-com:mac:vml" xmlns:o="urn:schemas-microsoft-com:office:office" xmlns:r="http://schemas.openxmlformats.org/officeDocument/2006/relationships" xmlns:v="urn:schemas-microsoft-com:vml" xmlns:w10="urn:schemas-microsoft-com:office:word" xmlns:w14="http://schemas.microsoft.com/office/word/2010/wordml" xmlns:w="http://schemas.openxmlformats.org/wordprocessingml/2006/main" xmlns:wne="http://schemas.microsoft.com/office/word/2006/wordml" xmlns:wp14="http://schemas.microsoft.com/office/word/2010/wordprocessingDrawing" xmlns:wp="http://schemas.openxmlformats.org/drawingml/2006/wordprocessingDrawing" xmlns:wpc="http://schemas.microsoft.com/office/word/2010/wordprocessingCanvas" xmlns:wpg="http://schemas.microsoft.com/office/word/2010/wordprocessingGroup" xmlns:wpi="http://schemas.microsoft.com/office/word/2010/wordprocessingInk" xmlns:wps="http://schemas.microsoft.com/office/word/2010/wordprocessingShape" mc:Ignorable="w14 wp14">
+  <w:p>
+    <w:pPr>
+      <w:pStyle w:val="Header"/>
+    </w:pPr>
+  </w:p>
+</w:hdr>
+</file>
+
+<file path=word/header2.xml><?xml version="1.0" encoding="utf-8"?>
+<w:hdr xmlns:m="http://schemas.openxmlformats.org/officeDocument/2006/math" xmlns:mc="http://schemas.openxmlformats.org/markup-compatibility/2006" xmlns:mo="http://schemas.microsoft.com/office/mac/office/2008/main" xmlns:mv="urn:schemas-microsoft-com:mac:vml" xmlns:o="urn:schemas-microsoft-com:office:office" xmlns:r="http://schemas.openxmlformats.org/officeDocument/2006/relationships" xmlns:v="urn:schemas-microsoft-com:vml" xmlns:w10="urn:schemas-microsoft-com:office:word" xmlns:w14="http://schemas.microsoft.com/office/word/2010/wordml" xmlns:w="http://schemas.openxmlformats.org/wordprocessingml/2006/main" xmlns:wne="http://schemas.microsoft.com/office/word/2006/wordml" xmlns:wp14="http://schemas.microsoft.com/office/word/2010/wordprocessingDrawing" xmlns:wp="http://schemas.openxmlformats.org/drawingml/2006/wordprocessingDrawing" xmlns:wpc="http://schemas.microsoft.com/office/word/2010/wordprocessingCanvas" xmlns:wpg="http://schemas.microsoft.com/office/word/2010/wordprocessingGroup" xmlns:wpi="http://schemas.microsoft.com/office/word/2010/wordprocessingInk" xmlns:wps="http://schemas.microsoft.com/office/word/2010/wordprocessingShape" mc:Ignorable="w14 wp14">
+  <w:p>
+    <w:pPr>
+      <w:pStyle w:val="Header"/>
+    </w:pPr>
+  </w:p>
+</w:hdr>
+</file>
+
+<file path=word/header3.xml><?xml version="1.0" encoding="utf-8"?>
+<w:hdr xmlns:m="http://schemas.openxmlformats.org/officeDocument/2006/math" xmlns:mc="http://schemas.openxmlformats.org/markup-compatibility/2006" xmlns:mo="http://schemas.microsoft.com/office/mac/office/2008/main" xmlns:mv="urn:schemas-microsoft-com:mac:vml" xmlns:o="urn:schemas-microsoft-com:office:office" xmlns:r="http://schemas.openxmlformats.org/officeDocument/2006/relationships" xmlns:v="urn:schemas-microsoft-com:vml" xmlns:w10="urn:schemas-microsoft-com:office:word" xmlns:w14="http://schemas.microsoft.com/office/word/2010/wordml" xmlns:w="http://schemas.openxmlformats.org/wordprocessingml/2006/main" xmlns:wne="http://schemas.microsoft.com/office/word/2006/wordml" xmlns:wp14="http://schemas.microsoft.com/office/word/2010/wordprocessingDrawing" xmlns:wp="http://schemas.openxmlformats.org/drawingml/2006/wordprocessingDrawing" xmlns:wpc="http://schemas.microsoft.com/office/word/2010/wordprocessingCanvas" xmlns:wpg="http://schemas.microsoft.com/office/word/2010/wordprocessingGroup" xmlns:wpi="http://schemas.microsoft.com/office/word/2010/wordprocessingInk" xmlns:wps="http://schemas.microsoft.com/office/word/2010/wordprocessingShape" mc:Ignorable="w14 wp14">
+  <w:p>
+    <w:pPr>
+      <w:pStyle w:val="Header"/>
+    </w:pPr>
+  </w:p>
+</w:hdr>
 </file>
 
 <file path=word/numbering.xml><?xml version="1.0" encoding="utf-8"?>

</xml_diff>

<commit_message>
Remove inputPrefix (operator files always in config/); add composite-key CDC job for multi-column-PK tables; docs updated
</commit_message>
<xml_diff>
--- a/docs/USAGE_GUIDE.docx
+++ b/docs/USAGE_GUIDE.docx
@@ -326,7 +326,7 @@
         <w:pStyle w:val="ListBullet"/>
       </w:pPr>
       <w:r>
-        <w:t>A single-column primary key on each table where possible. Tables with a multi-column primary key are not applied by the CDC job; they need a separate CDC process (see the Considerations and Limitations guide).</w:t>
+        <w:t>A single-column primary key on each table where possible. Tables with a multi-column (composite) primary key are applied by a separate composite CDC job that the pipeline creates and starts automatically after discovery when the task has any such table (see the Considerations and Limitations guide).</w:t>
       </w:r>
     </w:p>
     <w:p>
@@ -1235,7 +1235,7 @@
           <w:b w:val="0"/>
           <w:i w:val="0"/>
         </w:rPr>
-        <w:t>Start every migration — one task or many — through the fleet-startup state machine. Put one row per DMS task in fleet_tasks.csv (task_arn, optional task_suffix, optional adopt_existing_folder), upload it to the bucket, and launch the fleet once with the bucket and the folder that holds the list: {"bucket": "&lt;pipeline bucket&gt;", "inputPrefix": "&lt;folder of fleet_tasks.csv&gt;"}. Preflight checks every task first and starts nothing if any row fails; otherwise it starts one startup execution per task (five at a time) with that task's ARN.</w:t>
+        <w:t>Start every migration — one task or many — through the fleet-startup state machine. Put one row per DMS task in fleet_tasks.csv (task_arn, optional task_suffix, optional adopt_existing_folder), upload it to s3://&lt;bucket&gt;/config/, and launch the fleet once with just the bucket: {"bucket": "&lt;pipeline bucket&gt;"}. Operator files are always read from the fixed folder s3://&lt;bucket&gt;/config/ (fleet_tasks.csv, params.csv, pipeline.json). Preflight checks every task first and starts nothing if any row fails; otherwise it starts one startup execution per task (five at a time) with that task's ARN.</w:t>
       </w:r>
     </w:p>
     <w:tbl>

</xml_diff>

<commit_message>
Fix cutover (composite fields, re-runnable), fail fast on DMS start errors, validation commit on no-internet Glue, missing-target-table error, dsql_database in discovery; setup hardening; automatic DSQL private endpoint; CDC validation on by default; RUNBOOK prerequisites from the real test; validation handles empty source tables and very large tables within DSQL limits
</commit_message>
<xml_diff>
--- a/docs/USAGE_GUIDE.docx
+++ b/docs/USAGE_GUIDE.docx
@@ -469,7 +469,7 @@
     <w:p>
       <w:pPr/>
       <w:r>
-        <w:t>Put every setup value in one params.csv file and let the pipeline build the shared settings from it, so nobody retypes settings by hand. Copy config/params.example.csv, set account_id, Region, project, and dsql_endpoint (plus any optional keys), and upload it to s3://&lt;bucket&gt;/config/params.csv next to fleet_tasks.csv. Then run tools/setup.sh s3://&lt;bucket&gt;/config/params.csv to create or update all six IAM roles, eight Lambda functions, four state machines, and config/pipeline.json in one idempotent pass (add --dry-run to preview the commands, or --with-drivers to stage the Glue driver packages). The fleet reads the same params.csv at startup and safely republishes config/pipeline.json from it only when no startup, cutover, or fleet run is in progress, backing up the previous settings first. The account_id, subnet_id, and security_group_id values are used only by setup and are never written into config/pipeline.json.</w:t>
+        <w:t>Put every setup value in one params.csv file and let the pipeline build the shared settings from it, so nobody retypes settings by hand. Copy config/params.example.csv, set account_id, Region, project, and dsql_endpoint (plus any optional keys), and upload it to s3://&lt;bucket&gt;/config/params.csv next to fleet_tasks.csv. Then run tools/setup.sh s3://&lt;bucket&gt;/config/params.csv to create or update all three IAM roles, eight Lambda functions, four state machines, and config/pipeline.json in one idempotent pass (add --dry-run to preview the commands, or --with-drivers to stage the Glue driver packages). The fleet reads the same params.csv at startup and safely republishes config/pipeline.json from it only when no startup, cutover, or fleet run is in progress, backing up the previous settings first. The account_id, subnet_id, and security_group_id values are used only by setup and are never written into config/pipeline.json.</w:t>
       </w:r>
     </w:p>
     <w:tbl>
@@ -2628,6 +2628,11 @@
       </w:r>
     </w:p>
     <w:p>
+      <w:r>
+        <w:t>Change-data-capture validation is on by default: each CDC job re-reads a sample of every committed file's rows by key and records lasting mismatches in a control table, and cutover stops if any are unresolved (clear each reviewed row by setting resolved to true, never by deleting it, then re-run cutover). An empty source table passes when the target is also empty. Very large tables are validated in per-key-range queries, each in its own short transaction under the Aurora DSQL time limit; a range that is still too large is split smaller and retried, and composite-key tables are split on their first key column, so a table of any size can be validated.</w:t>
+      </w:r>
+    </w:p>
+    <w:p>
       <w:pPr>
         <w:pStyle w:val="Heading1"/>
       </w:pPr>

</xml_diff>